<commit_message>
add: Estágio Obrigatório - Relatório Final
</commit_message>
<xml_diff>
--- a/TCC/Projeto-de-Pesquisa-TCC.docx
+++ b/TCC/Projeto-de-Pesquisa-TCC.docx
@@ -7425,9 +7425,33 @@
     <w:p>
       <w:pPr>
         <w:rPr>
-          <w:color w:val="000000"/>
-        </w:rPr>
-      </w:pPr>
+          <w:strike/>
+          <w:color w:val="000000"/>
+        </w:rPr>
+      </w:pPr>
+      <w:r>
+        <w:rPr>
+          <w:strike/>
+          <w:color w:val="000000"/>
+        </w:rPr>
+        <w:t xml:space="preserve">WAZLAWICK, Raul S. </w:t>
+      </w:r>
+      <w:r>
+        <w:rPr>
+          <w:b/>
+          <w:bCs/>
+          <w:strike/>
+          <w:color w:val="000000"/>
+        </w:rPr>
+        <w:t>Metodologia de Pesquisa para Ciência da Computação</w:t>
+      </w:r>
+      <w:r>
+        <w:rPr>
+          <w:strike/>
+          <w:color w:val="000000"/>
+        </w:rPr>
+        <w:t>. 3. ed. Rio de Janeiro: GEN LTC, 2020. E-book. p.37. ISBN 9788595157712. Disponível em: https://integrada.minhabiblioteca.com.br/reader/books/9788595157712/. Acesso em: 24 mar. 2026.</w:t>
+      </w:r>
     </w:p>
     <w:p/>
     <w:p/>
@@ -7681,6 +7705,11 @@
         <w:docPartUnique/>
       </w:docPartObj>
     </w:sdtPr>
+    <w:sdtEndPr>
+      <w:rPr>
+        <w:rStyle w:val="PageNumber"/>
+      </w:rPr>
+    </w:sdtEndPr>
     <w:sdtContent>
       <w:p>
         <w:pPr>
@@ -7739,6 +7768,11 @@
         <w:docPartUnique/>
       </w:docPartObj>
     </w:sdtPr>
+    <w:sdtEndPr>
+      <w:rPr>
+        <w:rStyle w:val="PageNumber"/>
+      </w:rPr>
+    </w:sdtEndPr>
     <w:sdtContent>
       <w:p>
         <w:pPr>

</xml_diff>

<commit_message>
update: TCC-Projeto de Pesquisa
</commit_message>
<xml_diff>
--- a/TCC/Projeto-de-Pesquisa-TCC.docx
+++ b/TCC/Projeto-de-Pesquisa-TCC.docx
@@ -3829,9 +3829,14 @@
       <w:pPr>
         <w:pStyle w:val="NormalWeb"/>
         <w:spacing w:before="0" w:beforeAutospacing="0" w:after="160" w:afterAutospacing="0" w:line="360" w:lineRule="auto"/>
-      </w:pPr>
-      <w:r>
-        <w:rPr>
+        <w:rPr>
+          <w:strike/>
+          <w:color w:val="000000"/>
+        </w:rPr>
+      </w:pPr>
+      <w:r>
+        <w:rPr>
+          <w:strike/>
           <w:color w:val="000000"/>
         </w:rPr>
         <w:t>Adicionalmente, foi identificado o repositório Mobility Database (</w:t>
@@ -3840,12 +3845,14 @@
         <w:r>
           <w:rPr>
             <w:rStyle w:val="Hyperlink"/>
+            <w:strike/>
           </w:rPr>
           <w:t>https://mobilitydatabase.org/feeds/gtfs/mdb-8</w:t>
         </w:r>
       </w:hyperlink>
       <w:r>
         <w:rPr>
+          <w:strike/>
           <w:color w:val="000000"/>
         </w:rPr>
         <w:t xml:space="preserve">), mantido pela organização MobilityData, que disponibiliza o </w:t>
@@ -3854,27 +3861,869 @@
         <w:rPr>
           <w:i/>
           <w:iCs/>
+          <w:strike/>
           <w:color w:val="000000"/>
         </w:rPr>
         <w:t>feed</w:t>
       </w:r>
       <w:r>
         <w:rPr>
+          <w:strike/>
           <w:color w:val="000000"/>
         </w:rPr>
         <w:t xml:space="preserve"> GTFS oficial da SPTrans com validação automatizada e histórico de versões </w:t>
       </w:r>
       <w:r>
         <w:rPr>
+          <w:strike/>
           <w:color w:val="000000"/>
         </w:rPr>
         <w:t>periódicas</w:t>
       </w:r>
       <w:r>
         <w:rPr>
+          <w:strike/>
           <w:color w:val="000000"/>
         </w:rPr>
         <w:t>. O relatório de qualidade mais recente indica 1 erro e 10 avisos no conjunto de dados, atestando a consistência geral da base utilizada.</w:t>
+      </w:r>
+    </w:p>
+    <w:p>
+      <w:pPr>
+        <w:pStyle w:val="NormalWeb"/>
+        <w:spacing w:before="0" w:beforeAutospacing="0" w:after="160" w:afterAutospacing="0" w:line="360" w:lineRule="auto"/>
+        <w:rPr>
+          <w:strike/>
+          <w:color w:val="000000"/>
+        </w:rPr>
+      </w:pPr>
+    </w:p>
+    <w:p>
+      <w:pPr>
+        <w:pStyle w:val="Caption"/>
+        <w:keepNext/>
+      </w:pPr>
+      <w:r>
+        <w:lastRenderedPageBreak/>
+        <w:t xml:space="preserve">Tabela </w:t>
+      </w:r>
+      <w:fldSimple w:instr=" SEQ Tabela \* ARABIC ">
+        <w:r>
+          <w:rPr>
+            <w:noProof/>
+          </w:rPr>
+          <w:t>1</w:t>
+        </w:r>
+      </w:fldSimple>
+      <w:r>
+        <w:t xml:space="preserve"> - Estrutura dos arquivos GTFS: número de registros e atributos</w:t>
+      </w:r>
+    </w:p>
+    <w:tbl>
+      <w:tblPr>
+        <w:tblStyle w:val="PlainTable2"/>
+        <w:tblW w:w="9071" w:type="dxa"/>
+        <w:tblLook w:val="04A0" w:firstRow="1" w:lastRow="0" w:firstColumn="1" w:lastColumn="0" w:noHBand="0" w:noVBand="1"/>
+      </w:tblPr>
+      <w:tblGrid>
+        <w:gridCol w:w="2475"/>
+        <w:gridCol w:w="3269"/>
+        <w:gridCol w:w="3327"/>
+      </w:tblGrid>
+      <w:tr>
+        <w:trPr>
+          <w:cnfStyle w:val="100000000000" w:firstRow="1" w:lastRow="0" w:firstColumn="0" w:lastColumn="0" w:oddVBand="0" w:evenVBand="0" w:oddHBand="0" w:evenHBand="0" w:firstRowFirstColumn="0" w:firstRowLastColumn="0" w:lastRowFirstColumn="0" w:lastRowLastColumn="0"/>
+        </w:trPr>
+        <w:tc>
+          <w:tcPr>
+            <w:cnfStyle w:val="001000000000" w:firstRow="0" w:lastRow="0" w:firstColumn="1" w:lastColumn="0" w:oddVBand="0" w:evenVBand="0" w:oddHBand="0" w:evenHBand="0" w:firstRowFirstColumn="0" w:firstRowLastColumn="0" w:lastRowFirstColumn="0" w:lastRowLastColumn="0"/>
+            <w:tcW w:w="0" w:type="auto"/>
+            <w:hideMark/>
+          </w:tcPr>
+          <w:p>
+            <w:pPr>
+              <w:pStyle w:val="NormalWeb"/>
+              <w:spacing w:before="0" w:beforeAutospacing="0" w:after="0" w:afterAutospacing="0" w:line="360" w:lineRule="auto"/>
+              <w:jc w:val="center"/>
+            </w:pPr>
+            <w:r>
+              <w:rPr>
+                <w:color w:val="000000"/>
+              </w:rPr>
+              <w:t>Arquivo</w:t>
+            </w:r>
+          </w:p>
+        </w:tc>
+        <w:tc>
+          <w:tcPr>
+            <w:tcW w:w="0" w:type="auto"/>
+            <w:hideMark/>
+          </w:tcPr>
+          <w:p>
+            <w:pPr>
+              <w:pStyle w:val="NormalWeb"/>
+              <w:spacing w:before="0" w:beforeAutospacing="0" w:after="0" w:afterAutospacing="0" w:line="360" w:lineRule="auto"/>
+              <w:jc w:val="center"/>
+              <w:cnfStyle w:val="100000000000" w:firstRow="1" w:lastRow="0" w:firstColumn="0" w:lastColumn="0" w:oddVBand="0" w:evenVBand="0" w:oddHBand="0" w:evenHBand="0" w:firstRowFirstColumn="0" w:firstRowLastColumn="0" w:lastRowFirstColumn="0" w:lastRowLastColumn="0"/>
+            </w:pPr>
+            <w:r>
+              <w:rPr>
+                <w:color w:val="000000"/>
+              </w:rPr>
+              <w:t xml:space="preserve">Número de </w:t>
+            </w:r>
+            <w:r>
+              <w:rPr>
+                <w:color w:val="000000"/>
+              </w:rPr>
+              <w:t>registros</w:t>
+            </w:r>
+          </w:p>
+        </w:tc>
+        <w:tc>
+          <w:tcPr>
+            <w:tcW w:w="0" w:type="auto"/>
+            <w:hideMark/>
+          </w:tcPr>
+          <w:p>
+            <w:pPr>
+              <w:pStyle w:val="NormalWeb"/>
+              <w:spacing w:before="0" w:beforeAutospacing="0" w:after="0" w:afterAutospacing="0" w:line="360" w:lineRule="auto"/>
+              <w:jc w:val="center"/>
+              <w:cnfStyle w:val="100000000000" w:firstRow="1" w:lastRow="0" w:firstColumn="0" w:lastColumn="0" w:oddVBand="0" w:evenVBand="0" w:oddHBand="0" w:evenHBand="0" w:firstRowFirstColumn="0" w:firstRowLastColumn="0" w:lastRowFirstColumn="0" w:lastRowLastColumn="0"/>
+            </w:pPr>
+            <w:r>
+              <w:rPr>
+                <w:color w:val="000000"/>
+              </w:rPr>
+              <w:t xml:space="preserve">Número de </w:t>
+            </w:r>
+            <w:r>
+              <w:rPr>
+                <w:color w:val="000000"/>
+              </w:rPr>
+              <w:t>atributos</w:t>
+            </w:r>
+          </w:p>
+        </w:tc>
+      </w:tr>
+      <w:tr>
+        <w:trPr>
+          <w:cnfStyle w:val="000000100000" w:firstRow="0" w:lastRow="0" w:firstColumn="0" w:lastColumn="0" w:oddVBand="0" w:evenVBand="0" w:oddHBand="1" w:evenHBand="0" w:firstRowFirstColumn="0" w:firstRowLastColumn="0" w:lastRowFirstColumn="0" w:lastRowLastColumn="0"/>
+        </w:trPr>
+        <w:tc>
+          <w:tcPr>
+            <w:cnfStyle w:val="001000000000" w:firstRow="0" w:lastRow="0" w:firstColumn="1" w:lastColumn="0" w:oddVBand="0" w:evenVBand="0" w:oddHBand="0" w:evenHBand="0" w:firstRowFirstColumn="0" w:firstRowLastColumn="0" w:lastRowFirstColumn="0" w:lastRowLastColumn="0"/>
+            <w:tcW w:w="0" w:type="auto"/>
+            <w:hideMark/>
+          </w:tcPr>
+          <w:p>
+            <w:pPr>
+              <w:pStyle w:val="NormalWeb"/>
+              <w:spacing w:before="0" w:beforeAutospacing="0" w:after="0" w:afterAutospacing="0" w:line="360" w:lineRule="auto"/>
+            </w:pPr>
+            <w:r>
+              <w:rPr>
+                <w:color w:val="000000"/>
+              </w:rPr>
+              <w:t>agency</w:t>
+            </w:r>
+          </w:p>
+        </w:tc>
+        <w:tc>
+          <w:tcPr>
+            <w:tcW w:w="0" w:type="auto"/>
+            <w:hideMark/>
+          </w:tcPr>
+          <w:p>
+            <w:pPr>
+              <w:pStyle w:val="NormalWeb"/>
+              <w:spacing w:before="0" w:beforeAutospacing="0" w:after="0" w:afterAutospacing="0" w:line="360" w:lineRule="auto"/>
+              <w:jc w:val="center"/>
+              <w:cnfStyle w:val="000000100000" w:firstRow="0" w:lastRow="0" w:firstColumn="0" w:lastColumn="0" w:oddVBand="0" w:evenVBand="0" w:oddHBand="1" w:evenHBand="0" w:firstRowFirstColumn="0" w:firstRowLastColumn="0" w:lastRowFirstColumn="0" w:lastRowLastColumn="0"/>
+            </w:pPr>
+            <w:r>
+              <w:rPr>
+                <w:color w:val="000000"/>
+              </w:rPr>
+              <w:t>1</w:t>
+            </w:r>
+          </w:p>
+        </w:tc>
+        <w:tc>
+          <w:tcPr>
+            <w:tcW w:w="0" w:type="auto"/>
+            <w:hideMark/>
+          </w:tcPr>
+          <w:p>
+            <w:pPr>
+              <w:pStyle w:val="NormalWeb"/>
+              <w:spacing w:before="0" w:beforeAutospacing="0" w:after="0" w:afterAutospacing="0" w:line="360" w:lineRule="auto"/>
+              <w:jc w:val="center"/>
+              <w:cnfStyle w:val="000000100000" w:firstRow="0" w:lastRow="0" w:firstColumn="0" w:lastColumn="0" w:oddVBand="0" w:evenVBand="0" w:oddHBand="1" w:evenHBand="0" w:firstRowFirstColumn="0" w:firstRowLastColumn="0" w:lastRowFirstColumn="0" w:lastRowLastColumn="0"/>
+            </w:pPr>
+            <w:r>
+              <w:rPr>
+                <w:color w:val="000000"/>
+              </w:rPr>
+              <w:t>5</w:t>
+            </w:r>
+          </w:p>
+        </w:tc>
+      </w:tr>
+      <w:tr>
+        <w:tc>
+          <w:tcPr>
+            <w:cnfStyle w:val="001000000000" w:firstRow="0" w:lastRow="0" w:firstColumn="1" w:lastColumn="0" w:oddVBand="0" w:evenVBand="0" w:oddHBand="0" w:evenHBand="0" w:firstRowFirstColumn="0" w:firstRowLastColumn="0" w:lastRowFirstColumn="0" w:lastRowLastColumn="0"/>
+            <w:tcW w:w="0" w:type="auto"/>
+            <w:hideMark/>
+          </w:tcPr>
+          <w:p>
+            <w:pPr>
+              <w:pStyle w:val="NormalWeb"/>
+              <w:spacing w:before="0" w:beforeAutospacing="0" w:after="0" w:afterAutospacing="0" w:line="360" w:lineRule="auto"/>
+            </w:pPr>
+            <w:r>
+              <w:rPr>
+                <w:color w:val="000000"/>
+              </w:rPr>
+              <w:t>calendar</w:t>
+            </w:r>
+          </w:p>
+        </w:tc>
+        <w:tc>
+          <w:tcPr>
+            <w:tcW w:w="0" w:type="auto"/>
+            <w:hideMark/>
+          </w:tcPr>
+          <w:p>
+            <w:pPr>
+              <w:pStyle w:val="NormalWeb"/>
+              <w:spacing w:before="0" w:beforeAutospacing="0" w:after="0" w:afterAutospacing="0" w:line="360" w:lineRule="auto"/>
+              <w:jc w:val="center"/>
+              <w:cnfStyle w:val="000000000000" w:firstRow="0" w:lastRow="0" w:firstColumn="0" w:lastColumn="0" w:oddVBand="0" w:evenVBand="0" w:oddHBand="0" w:evenHBand="0" w:firstRowFirstColumn="0" w:firstRowLastColumn="0" w:lastRowFirstColumn="0" w:lastRowLastColumn="0"/>
+            </w:pPr>
+            <w:r>
+              <w:rPr>
+                <w:color w:val="000000"/>
+              </w:rPr>
+              <w:t>6</w:t>
+            </w:r>
+          </w:p>
+        </w:tc>
+        <w:tc>
+          <w:tcPr>
+            <w:tcW w:w="0" w:type="auto"/>
+            <w:hideMark/>
+          </w:tcPr>
+          <w:p>
+            <w:pPr>
+              <w:pStyle w:val="NormalWeb"/>
+              <w:spacing w:before="0" w:beforeAutospacing="0" w:after="0" w:afterAutospacing="0" w:line="360" w:lineRule="auto"/>
+              <w:jc w:val="center"/>
+              <w:cnfStyle w:val="000000000000" w:firstRow="0" w:lastRow="0" w:firstColumn="0" w:lastColumn="0" w:oddVBand="0" w:evenVBand="0" w:oddHBand="0" w:evenHBand="0" w:firstRowFirstColumn="0" w:firstRowLastColumn="0" w:lastRowFirstColumn="0" w:lastRowLastColumn="0"/>
+            </w:pPr>
+            <w:r>
+              <w:rPr>
+                <w:color w:val="000000"/>
+              </w:rPr>
+              <w:t>10</w:t>
+            </w:r>
+          </w:p>
+        </w:tc>
+      </w:tr>
+      <w:tr>
+        <w:trPr>
+          <w:cnfStyle w:val="000000100000" w:firstRow="0" w:lastRow="0" w:firstColumn="0" w:lastColumn="0" w:oddVBand="0" w:evenVBand="0" w:oddHBand="1" w:evenHBand="0" w:firstRowFirstColumn="0" w:firstRowLastColumn="0" w:lastRowFirstColumn="0" w:lastRowLastColumn="0"/>
+        </w:trPr>
+        <w:tc>
+          <w:tcPr>
+            <w:cnfStyle w:val="001000000000" w:firstRow="0" w:lastRow="0" w:firstColumn="1" w:lastColumn="0" w:oddVBand="0" w:evenVBand="0" w:oddHBand="0" w:evenHBand="0" w:firstRowFirstColumn="0" w:firstRowLastColumn="0" w:lastRowFirstColumn="0" w:lastRowLastColumn="0"/>
+            <w:tcW w:w="0" w:type="auto"/>
+            <w:hideMark/>
+          </w:tcPr>
+          <w:p>
+            <w:pPr>
+              <w:pStyle w:val="NormalWeb"/>
+              <w:spacing w:before="0" w:beforeAutospacing="0" w:after="0" w:afterAutospacing="0" w:line="360" w:lineRule="auto"/>
+            </w:pPr>
+            <w:r>
+              <w:rPr>
+                <w:color w:val="000000"/>
+              </w:rPr>
+              <w:t>fare_attributes</w:t>
+            </w:r>
+          </w:p>
+        </w:tc>
+        <w:tc>
+          <w:tcPr>
+            <w:tcW w:w="0" w:type="auto"/>
+            <w:hideMark/>
+          </w:tcPr>
+          <w:p>
+            <w:pPr>
+              <w:pStyle w:val="NormalWeb"/>
+              <w:spacing w:before="0" w:beforeAutospacing="0" w:after="0" w:afterAutospacing="0" w:line="360" w:lineRule="auto"/>
+              <w:jc w:val="center"/>
+              <w:cnfStyle w:val="000000100000" w:firstRow="0" w:lastRow="0" w:firstColumn="0" w:lastColumn="0" w:oddVBand="0" w:evenVBand="0" w:oddHBand="1" w:evenHBand="0" w:firstRowFirstColumn="0" w:firstRowLastColumn="0" w:lastRowFirstColumn="0" w:lastRowLastColumn="0"/>
+            </w:pPr>
+            <w:r>
+              <w:rPr>
+                <w:color w:val="000000"/>
+              </w:rPr>
+              <w:t>6</w:t>
+            </w:r>
+          </w:p>
+        </w:tc>
+        <w:tc>
+          <w:tcPr>
+            <w:tcW w:w="0" w:type="auto"/>
+            <w:hideMark/>
+          </w:tcPr>
+          <w:p>
+            <w:pPr>
+              <w:pStyle w:val="NormalWeb"/>
+              <w:spacing w:before="0" w:beforeAutospacing="0" w:after="0" w:afterAutospacing="0" w:line="360" w:lineRule="auto"/>
+              <w:jc w:val="center"/>
+              <w:cnfStyle w:val="000000100000" w:firstRow="0" w:lastRow="0" w:firstColumn="0" w:lastColumn="0" w:oddVBand="0" w:evenVBand="0" w:oddHBand="1" w:evenHBand="0" w:firstRowFirstColumn="0" w:firstRowLastColumn="0" w:lastRowFirstColumn="0" w:lastRowLastColumn="0"/>
+            </w:pPr>
+            <w:r>
+              <w:rPr>
+                <w:color w:val="000000"/>
+              </w:rPr>
+              <w:t>6</w:t>
+            </w:r>
+          </w:p>
+        </w:tc>
+      </w:tr>
+      <w:tr>
+        <w:tc>
+          <w:tcPr>
+            <w:cnfStyle w:val="001000000000" w:firstRow="0" w:lastRow="0" w:firstColumn="1" w:lastColumn="0" w:oddVBand="0" w:evenVBand="0" w:oddHBand="0" w:evenHBand="0" w:firstRowFirstColumn="0" w:firstRowLastColumn="0" w:lastRowFirstColumn="0" w:lastRowLastColumn="0"/>
+            <w:tcW w:w="0" w:type="auto"/>
+            <w:hideMark/>
+          </w:tcPr>
+          <w:p>
+            <w:pPr>
+              <w:pStyle w:val="NormalWeb"/>
+              <w:spacing w:before="0" w:beforeAutospacing="0" w:after="0" w:afterAutospacing="0" w:line="360" w:lineRule="auto"/>
+            </w:pPr>
+            <w:r>
+              <w:rPr>
+                <w:color w:val="000000"/>
+              </w:rPr>
+              <w:t>fare_rules</w:t>
+            </w:r>
+          </w:p>
+        </w:tc>
+        <w:tc>
+          <w:tcPr>
+            <w:tcW w:w="0" w:type="auto"/>
+            <w:hideMark/>
+          </w:tcPr>
+          <w:p>
+            <w:pPr>
+              <w:pStyle w:val="NormalWeb"/>
+              <w:spacing w:before="0" w:beforeAutospacing="0" w:after="0" w:afterAutospacing="0" w:line="360" w:lineRule="auto"/>
+              <w:jc w:val="center"/>
+              <w:cnfStyle w:val="000000000000" w:firstRow="0" w:lastRow="0" w:firstColumn="0" w:lastColumn="0" w:oddVBand="0" w:evenVBand="0" w:oddHBand="0" w:evenHBand="0" w:firstRowFirstColumn="0" w:firstRowLastColumn="0" w:lastRowFirstColumn="0" w:lastRowLastColumn="0"/>
+            </w:pPr>
+            <w:r>
+              <w:rPr>
+                <w:color w:val="000000"/>
+              </w:rPr>
+              <w:t>5.379</w:t>
+            </w:r>
+          </w:p>
+        </w:tc>
+        <w:tc>
+          <w:tcPr>
+            <w:tcW w:w="0" w:type="auto"/>
+            <w:hideMark/>
+          </w:tcPr>
+          <w:p>
+            <w:pPr>
+              <w:pStyle w:val="NormalWeb"/>
+              <w:spacing w:before="0" w:beforeAutospacing="0" w:after="0" w:afterAutospacing="0" w:line="360" w:lineRule="auto"/>
+              <w:jc w:val="center"/>
+              <w:cnfStyle w:val="000000000000" w:firstRow="0" w:lastRow="0" w:firstColumn="0" w:lastColumn="0" w:oddVBand="0" w:evenVBand="0" w:oddHBand="0" w:evenHBand="0" w:firstRowFirstColumn="0" w:firstRowLastColumn="0" w:lastRowFirstColumn="0" w:lastRowLastColumn="0"/>
+            </w:pPr>
+            <w:r>
+              <w:rPr>
+                <w:color w:val="000000"/>
+              </w:rPr>
+              <w:t>5</w:t>
+            </w:r>
+          </w:p>
+        </w:tc>
+      </w:tr>
+      <w:tr>
+        <w:trPr>
+          <w:cnfStyle w:val="000000100000" w:firstRow="0" w:lastRow="0" w:firstColumn="0" w:lastColumn="0" w:oddVBand="0" w:evenVBand="0" w:oddHBand="1" w:evenHBand="0" w:firstRowFirstColumn="0" w:firstRowLastColumn="0" w:lastRowFirstColumn="0" w:lastRowLastColumn="0"/>
+        </w:trPr>
+        <w:tc>
+          <w:tcPr>
+            <w:cnfStyle w:val="001000000000" w:firstRow="0" w:lastRow="0" w:firstColumn="1" w:lastColumn="0" w:oddVBand="0" w:evenVBand="0" w:oddHBand="0" w:evenHBand="0" w:firstRowFirstColumn="0" w:firstRowLastColumn="0" w:lastRowFirstColumn="0" w:lastRowLastColumn="0"/>
+            <w:tcW w:w="0" w:type="auto"/>
+            <w:hideMark/>
+          </w:tcPr>
+          <w:p>
+            <w:pPr>
+              <w:pStyle w:val="NormalWeb"/>
+              <w:spacing w:before="0" w:beforeAutospacing="0" w:after="0" w:afterAutospacing="0" w:line="360" w:lineRule="auto"/>
+            </w:pPr>
+            <w:r>
+              <w:rPr>
+                <w:color w:val="000000"/>
+              </w:rPr>
+              <w:t>frequencies</w:t>
+            </w:r>
+          </w:p>
+        </w:tc>
+        <w:tc>
+          <w:tcPr>
+            <w:tcW w:w="0" w:type="auto"/>
+            <w:hideMark/>
+          </w:tcPr>
+          <w:p>
+            <w:pPr>
+              <w:pStyle w:val="NormalWeb"/>
+              <w:spacing w:before="0" w:beforeAutospacing="0" w:after="0" w:afterAutospacing="0" w:line="360" w:lineRule="auto"/>
+              <w:jc w:val="center"/>
+              <w:cnfStyle w:val="000000100000" w:firstRow="0" w:lastRow="0" w:firstColumn="0" w:lastColumn="0" w:oddVBand="0" w:evenVBand="0" w:oddHBand="1" w:evenHBand="0" w:firstRowFirstColumn="0" w:firstRowLastColumn="0" w:lastRowFirstColumn="0" w:lastRowLastColumn="0"/>
+            </w:pPr>
+            <w:r>
+              <w:rPr>
+                <w:color w:val="000000"/>
+              </w:rPr>
+              <w:t>40.146</w:t>
+            </w:r>
+          </w:p>
+        </w:tc>
+        <w:tc>
+          <w:tcPr>
+            <w:tcW w:w="0" w:type="auto"/>
+            <w:hideMark/>
+          </w:tcPr>
+          <w:p>
+            <w:pPr>
+              <w:pStyle w:val="NormalWeb"/>
+              <w:spacing w:before="0" w:beforeAutospacing="0" w:after="0" w:afterAutospacing="0" w:line="360" w:lineRule="auto"/>
+              <w:jc w:val="center"/>
+              <w:cnfStyle w:val="000000100000" w:firstRow="0" w:lastRow="0" w:firstColumn="0" w:lastColumn="0" w:oddVBand="0" w:evenVBand="0" w:oddHBand="1" w:evenHBand="0" w:firstRowFirstColumn="0" w:firstRowLastColumn="0" w:lastRowFirstColumn="0" w:lastRowLastColumn="0"/>
+            </w:pPr>
+            <w:r>
+              <w:rPr>
+                <w:color w:val="000000"/>
+              </w:rPr>
+              <w:t>4</w:t>
+            </w:r>
+          </w:p>
+        </w:tc>
+      </w:tr>
+      <w:tr>
+        <w:tc>
+          <w:tcPr>
+            <w:cnfStyle w:val="001000000000" w:firstRow="0" w:lastRow="0" w:firstColumn="1" w:lastColumn="0" w:oddVBand="0" w:evenVBand="0" w:oddHBand="0" w:evenHBand="0" w:firstRowFirstColumn="0" w:firstRowLastColumn="0" w:lastRowFirstColumn="0" w:lastRowLastColumn="0"/>
+            <w:tcW w:w="0" w:type="auto"/>
+            <w:hideMark/>
+          </w:tcPr>
+          <w:p>
+            <w:pPr>
+              <w:pStyle w:val="NormalWeb"/>
+              <w:spacing w:before="0" w:beforeAutospacing="0" w:after="0" w:afterAutospacing="0" w:line="360" w:lineRule="auto"/>
+            </w:pPr>
+            <w:r>
+              <w:rPr>
+                <w:color w:val="000000"/>
+              </w:rPr>
+              <w:t>routes</w:t>
+            </w:r>
+          </w:p>
+        </w:tc>
+        <w:tc>
+          <w:tcPr>
+            <w:tcW w:w="0" w:type="auto"/>
+            <w:hideMark/>
+          </w:tcPr>
+          <w:p>
+            <w:pPr>
+              <w:pStyle w:val="NormalWeb"/>
+              <w:spacing w:before="0" w:beforeAutospacing="0" w:after="0" w:afterAutospacing="0" w:line="360" w:lineRule="auto"/>
+              <w:jc w:val="center"/>
+              <w:cnfStyle w:val="000000000000" w:firstRow="0" w:lastRow="0" w:firstColumn="0" w:lastColumn="0" w:oddVBand="0" w:evenVBand="0" w:oddHBand="0" w:evenHBand="0" w:firstRowFirstColumn="0" w:firstRowLastColumn="0" w:lastRowFirstColumn="0" w:lastRowLastColumn="0"/>
+            </w:pPr>
+            <w:r>
+              <w:rPr>
+                <w:color w:val="000000"/>
+              </w:rPr>
+              <w:t>1348</w:t>
+            </w:r>
+          </w:p>
+        </w:tc>
+        <w:tc>
+          <w:tcPr>
+            <w:tcW w:w="0" w:type="auto"/>
+            <w:hideMark/>
+          </w:tcPr>
+          <w:p>
+            <w:pPr>
+              <w:pStyle w:val="NormalWeb"/>
+              <w:spacing w:before="0" w:beforeAutospacing="0" w:after="0" w:afterAutospacing="0" w:line="360" w:lineRule="auto"/>
+              <w:jc w:val="center"/>
+              <w:cnfStyle w:val="000000000000" w:firstRow="0" w:lastRow="0" w:firstColumn="0" w:lastColumn="0" w:oddVBand="0" w:evenVBand="0" w:oddHBand="0" w:evenHBand="0" w:firstRowFirstColumn="0" w:firstRowLastColumn="0" w:lastRowFirstColumn="0" w:lastRowLastColumn="0"/>
+            </w:pPr>
+            <w:r>
+              <w:rPr>
+                <w:color w:val="000000"/>
+              </w:rPr>
+              <w:t>7</w:t>
+            </w:r>
+          </w:p>
+        </w:tc>
+      </w:tr>
+      <w:tr>
+        <w:trPr>
+          <w:cnfStyle w:val="000000100000" w:firstRow="0" w:lastRow="0" w:firstColumn="0" w:lastColumn="0" w:oddVBand="0" w:evenVBand="0" w:oddHBand="1" w:evenHBand="0" w:firstRowFirstColumn="0" w:firstRowLastColumn="0" w:lastRowFirstColumn="0" w:lastRowLastColumn="0"/>
+        </w:trPr>
+        <w:tc>
+          <w:tcPr>
+            <w:cnfStyle w:val="001000000000" w:firstRow="0" w:lastRow="0" w:firstColumn="1" w:lastColumn="0" w:oddVBand="0" w:evenVBand="0" w:oddHBand="0" w:evenHBand="0" w:firstRowFirstColumn="0" w:firstRowLastColumn="0" w:lastRowFirstColumn="0" w:lastRowLastColumn="0"/>
+            <w:tcW w:w="0" w:type="auto"/>
+            <w:hideMark/>
+          </w:tcPr>
+          <w:p>
+            <w:pPr>
+              <w:pStyle w:val="NormalWeb"/>
+              <w:spacing w:before="0" w:beforeAutospacing="0" w:after="0" w:afterAutospacing="0" w:line="360" w:lineRule="auto"/>
+            </w:pPr>
+            <w:r>
+              <w:rPr>
+                <w:color w:val="000000"/>
+              </w:rPr>
+              <w:t>shapes</w:t>
+            </w:r>
+          </w:p>
+        </w:tc>
+        <w:tc>
+          <w:tcPr>
+            <w:tcW w:w="0" w:type="auto"/>
+            <w:hideMark/>
+          </w:tcPr>
+          <w:p>
+            <w:pPr>
+              <w:pStyle w:val="NormalWeb"/>
+              <w:spacing w:before="0" w:beforeAutospacing="0" w:after="0" w:afterAutospacing="0" w:line="360" w:lineRule="auto"/>
+              <w:jc w:val="center"/>
+              <w:cnfStyle w:val="000000100000" w:firstRow="0" w:lastRow="0" w:firstColumn="0" w:lastColumn="0" w:oddVBand="0" w:evenVBand="0" w:oddHBand="1" w:evenHBand="0" w:firstRowFirstColumn="0" w:firstRowLastColumn="0" w:lastRowFirstColumn="0" w:lastRowLastColumn="0"/>
+            </w:pPr>
+            <w:r>
+              <w:rPr>
+                <w:color w:val="000000"/>
+              </w:rPr>
+              <w:t>1.134.502</w:t>
+            </w:r>
+          </w:p>
+        </w:tc>
+        <w:tc>
+          <w:tcPr>
+            <w:tcW w:w="0" w:type="auto"/>
+            <w:hideMark/>
+          </w:tcPr>
+          <w:p>
+            <w:pPr>
+              <w:pStyle w:val="NormalWeb"/>
+              <w:spacing w:before="0" w:beforeAutospacing="0" w:after="0" w:afterAutospacing="0" w:line="360" w:lineRule="auto"/>
+              <w:jc w:val="center"/>
+              <w:cnfStyle w:val="000000100000" w:firstRow="0" w:lastRow="0" w:firstColumn="0" w:lastColumn="0" w:oddVBand="0" w:evenVBand="0" w:oddHBand="1" w:evenHBand="0" w:firstRowFirstColumn="0" w:firstRowLastColumn="0" w:lastRowFirstColumn="0" w:lastRowLastColumn="0"/>
+            </w:pPr>
+            <w:r>
+              <w:rPr>
+                <w:color w:val="000000"/>
+              </w:rPr>
+              <w:t>5</w:t>
+            </w:r>
+          </w:p>
+        </w:tc>
+      </w:tr>
+      <w:tr>
+        <w:tc>
+          <w:tcPr>
+            <w:cnfStyle w:val="001000000000" w:firstRow="0" w:lastRow="0" w:firstColumn="1" w:lastColumn="0" w:oddVBand="0" w:evenVBand="0" w:oddHBand="0" w:evenHBand="0" w:firstRowFirstColumn="0" w:firstRowLastColumn="0" w:lastRowFirstColumn="0" w:lastRowLastColumn="0"/>
+            <w:tcW w:w="0" w:type="auto"/>
+            <w:hideMark/>
+          </w:tcPr>
+          <w:p>
+            <w:pPr>
+              <w:pStyle w:val="NormalWeb"/>
+              <w:spacing w:before="0" w:beforeAutospacing="0" w:after="0" w:afterAutospacing="0" w:line="360" w:lineRule="auto"/>
+            </w:pPr>
+            <w:r>
+              <w:rPr>
+                <w:color w:val="000000"/>
+              </w:rPr>
+              <w:t>stop_times</w:t>
+            </w:r>
+          </w:p>
+        </w:tc>
+        <w:tc>
+          <w:tcPr>
+            <w:tcW w:w="0" w:type="auto"/>
+            <w:hideMark/>
+          </w:tcPr>
+          <w:p>
+            <w:pPr>
+              <w:pStyle w:val="NormalWeb"/>
+              <w:spacing w:before="0" w:beforeAutospacing="0" w:after="0" w:afterAutospacing="0" w:line="360" w:lineRule="auto"/>
+              <w:jc w:val="center"/>
+              <w:cnfStyle w:val="000000000000" w:firstRow="0" w:lastRow="0" w:firstColumn="0" w:lastColumn="0" w:oddVBand="0" w:evenVBand="0" w:oddHBand="0" w:evenHBand="0" w:firstRowFirstColumn="0" w:firstRowLastColumn="0" w:lastRowFirstColumn="0" w:lastRowLastColumn="0"/>
+            </w:pPr>
+            <w:r>
+              <w:rPr>
+                <w:color w:val="000000"/>
+              </w:rPr>
+              <w:t>98.434</w:t>
+            </w:r>
+          </w:p>
+        </w:tc>
+        <w:tc>
+          <w:tcPr>
+            <w:tcW w:w="0" w:type="auto"/>
+            <w:hideMark/>
+          </w:tcPr>
+          <w:p>
+            <w:pPr>
+              <w:pStyle w:val="NormalWeb"/>
+              <w:spacing w:before="0" w:beforeAutospacing="0" w:after="0" w:afterAutospacing="0" w:line="360" w:lineRule="auto"/>
+              <w:jc w:val="center"/>
+              <w:cnfStyle w:val="000000000000" w:firstRow="0" w:lastRow="0" w:firstColumn="0" w:lastColumn="0" w:oddVBand="0" w:evenVBand="0" w:oddHBand="0" w:evenHBand="0" w:firstRowFirstColumn="0" w:firstRowLastColumn="0" w:lastRowFirstColumn="0" w:lastRowLastColumn="0"/>
+            </w:pPr>
+            <w:r>
+              <w:rPr>
+                <w:color w:val="000000"/>
+              </w:rPr>
+              <w:t>5</w:t>
+            </w:r>
+          </w:p>
+        </w:tc>
+      </w:tr>
+      <w:tr>
+        <w:trPr>
+          <w:cnfStyle w:val="000000100000" w:firstRow="0" w:lastRow="0" w:firstColumn="0" w:lastColumn="0" w:oddVBand="0" w:evenVBand="0" w:oddHBand="1" w:evenHBand="0" w:firstRowFirstColumn="0" w:firstRowLastColumn="0" w:lastRowFirstColumn="0" w:lastRowLastColumn="0"/>
+        </w:trPr>
+        <w:tc>
+          <w:tcPr>
+            <w:cnfStyle w:val="001000000000" w:firstRow="0" w:lastRow="0" w:firstColumn="1" w:lastColumn="0" w:oddVBand="0" w:evenVBand="0" w:oddHBand="0" w:evenHBand="0" w:firstRowFirstColumn="0" w:firstRowLastColumn="0" w:lastRowFirstColumn="0" w:lastRowLastColumn="0"/>
+            <w:tcW w:w="0" w:type="auto"/>
+            <w:hideMark/>
+          </w:tcPr>
+          <w:p>
+            <w:pPr>
+              <w:pStyle w:val="NormalWeb"/>
+              <w:spacing w:before="0" w:beforeAutospacing="0" w:after="0" w:afterAutospacing="0" w:line="360" w:lineRule="auto"/>
+            </w:pPr>
+            <w:r>
+              <w:rPr>
+                <w:color w:val="000000"/>
+              </w:rPr>
+              <w:t>stops</w:t>
+            </w:r>
+          </w:p>
+        </w:tc>
+        <w:tc>
+          <w:tcPr>
+            <w:tcW w:w="0" w:type="auto"/>
+            <w:hideMark/>
+          </w:tcPr>
+          <w:p>
+            <w:pPr>
+              <w:pStyle w:val="NormalWeb"/>
+              <w:spacing w:before="0" w:beforeAutospacing="0" w:after="0" w:afterAutospacing="0" w:line="360" w:lineRule="auto"/>
+              <w:jc w:val="center"/>
+              <w:cnfStyle w:val="000000100000" w:firstRow="0" w:lastRow="0" w:firstColumn="0" w:lastColumn="0" w:oddVBand="0" w:evenVBand="0" w:oddHBand="1" w:evenHBand="0" w:firstRowFirstColumn="0" w:firstRowLastColumn="0" w:lastRowFirstColumn="0" w:lastRowLastColumn="0"/>
+            </w:pPr>
+            <w:r>
+              <w:rPr>
+                <w:color w:val="000000"/>
+              </w:rPr>
+              <w:t>22.103</w:t>
+            </w:r>
+          </w:p>
+        </w:tc>
+        <w:tc>
+          <w:tcPr>
+            <w:tcW w:w="0" w:type="auto"/>
+            <w:hideMark/>
+          </w:tcPr>
+          <w:p>
+            <w:pPr>
+              <w:pStyle w:val="NormalWeb"/>
+              <w:spacing w:before="0" w:beforeAutospacing="0" w:after="0" w:afterAutospacing="0" w:line="360" w:lineRule="auto"/>
+              <w:jc w:val="center"/>
+              <w:cnfStyle w:val="000000100000" w:firstRow="0" w:lastRow="0" w:firstColumn="0" w:lastColumn="0" w:oddVBand="0" w:evenVBand="0" w:oddHBand="1" w:evenHBand="0" w:firstRowFirstColumn="0" w:firstRowLastColumn="0" w:lastRowFirstColumn="0" w:lastRowLastColumn="0"/>
+            </w:pPr>
+            <w:r>
+              <w:rPr>
+                <w:color w:val="000000"/>
+              </w:rPr>
+              <w:t>5</w:t>
+            </w:r>
+          </w:p>
+        </w:tc>
+      </w:tr>
+      <w:tr>
+        <w:tc>
+          <w:tcPr>
+            <w:cnfStyle w:val="001000000000" w:firstRow="0" w:lastRow="0" w:firstColumn="1" w:lastColumn="0" w:oddVBand="0" w:evenVBand="0" w:oddHBand="0" w:evenHBand="0" w:firstRowFirstColumn="0" w:firstRowLastColumn="0" w:lastRowFirstColumn="0" w:lastRowLastColumn="0"/>
+            <w:tcW w:w="0" w:type="auto"/>
+            <w:hideMark/>
+          </w:tcPr>
+          <w:p>
+            <w:pPr>
+              <w:pStyle w:val="NormalWeb"/>
+              <w:spacing w:before="0" w:beforeAutospacing="0" w:after="0" w:afterAutospacing="0" w:line="360" w:lineRule="auto"/>
+            </w:pPr>
+            <w:r>
+              <w:rPr>
+                <w:color w:val="000000"/>
+              </w:rPr>
+              <w:t>trips</w:t>
+            </w:r>
+          </w:p>
+        </w:tc>
+        <w:tc>
+          <w:tcPr>
+            <w:tcW w:w="0" w:type="auto"/>
+            <w:hideMark/>
+          </w:tcPr>
+          <w:p>
+            <w:pPr>
+              <w:pStyle w:val="NormalWeb"/>
+              <w:spacing w:before="0" w:beforeAutospacing="0" w:after="0" w:afterAutospacing="0" w:line="360" w:lineRule="auto"/>
+              <w:jc w:val="center"/>
+              <w:cnfStyle w:val="000000000000" w:firstRow="0" w:lastRow="0" w:firstColumn="0" w:lastColumn="0" w:oddVBand="0" w:evenVBand="0" w:oddHBand="0" w:evenHBand="0" w:firstRowFirstColumn="0" w:firstRowLastColumn="0" w:lastRowFirstColumn="0" w:lastRowLastColumn="0"/>
+            </w:pPr>
+            <w:r>
+              <w:rPr>
+                <w:color w:val="000000"/>
+              </w:rPr>
+              <w:t>2.254</w:t>
+            </w:r>
+          </w:p>
+        </w:tc>
+        <w:tc>
+          <w:tcPr>
+            <w:tcW w:w="0" w:type="auto"/>
+            <w:hideMark/>
+          </w:tcPr>
+          <w:p>
+            <w:pPr>
+              <w:pStyle w:val="NormalWeb"/>
+              <w:spacing w:before="0" w:beforeAutospacing="0" w:after="0" w:afterAutospacing="0" w:line="360" w:lineRule="auto"/>
+              <w:jc w:val="center"/>
+              <w:cnfStyle w:val="000000000000" w:firstRow="0" w:lastRow="0" w:firstColumn="0" w:lastColumn="0" w:oddVBand="0" w:evenVBand="0" w:oddHBand="0" w:evenHBand="0" w:firstRowFirstColumn="0" w:firstRowLastColumn="0" w:lastRowFirstColumn="0" w:lastRowLastColumn="0"/>
+            </w:pPr>
+            <w:r>
+              <w:rPr>
+                <w:color w:val="000000"/>
+              </w:rPr>
+              <w:t>6</w:t>
+            </w:r>
+          </w:p>
+        </w:tc>
+      </w:tr>
+    </w:tbl>
+    <w:p>
+      <w:pPr>
+        <w:pStyle w:val="NormalWeb"/>
+        <w:spacing w:before="0" w:beforeAutospacing="0" w:after="160" w:afterAutospacing="0" w:line="360" w:lineRule="auto"/>
+        <w:rPr>
+          <w:sz w:val="20"/>
+          <w:szCs w:val="20"/>
+        </w:rPr>
+      </w:pPr>
+      <w:r>
+        <w:rPr>
+          <w:sz w:val="20"/>
+          <w:szCs w:val="20"/>
+        </w:rPr>
+        <w:t>Fonte: Elaborado pelos autores (2026)</w:t>
+      </w:r>
+    </w:p>
+    <w:p>
+      <w:pPr>
+        <w:pStyle w:val="NormalWeb"/>
+        <w:spacing w:before="0" w:beforeAutospacing="0" w:after="160" w:afterAutospacing="0" w:line="360" w:lineRule="auto"/>
+        <w:rPr>
+          <w:sz w:val="20"/>
+          <w:szCs w:val="20"/>
+        </w:rPr>
+      </w:pPr>
+    </w:p>
+    <w:p>
+      <w:pPr>
+        <w:pStyle w:val="NormalWeb"/>
+        <w:spacing w:before="0" w:beforeAutospacing="0" w:after="160" w:afterAutospacing="0" w:line="360" w:lineRule="auto"/>
+        <w:rPr>
+          <w:sz w:val="20"/>
+          <w:szCs w:val="20"/>
+        </w:rPr>
+      </w:pPr>
+      <w:r>
+        <w:rPr>
+          <w:noProof/>
+          <w:color w:val="000000"/>
+          <w:bdr w:val="none" w:sz="0" w:space="0" w:color="auto" w:frame="1"/>
+          <w:lang w:val="pt-BR"/>
+        </w:rPr>
+        <w:drawing>
+          <wp:inline distT="0" distB="0" distL="0" distR="0" wp14:anchorId="3A1FAD32" wp14:editId="60534E1F">
+            <wp:extent cx="5756910" cy="4765040"/>
+            <wp:effectExtent l="0" t="0" r="0" b="0"/>
+            <wp:docPr id="1811502042" name="Picture 1"/>
+            <wp:cNvGraphicFramePr>
+              <a:graphicFrameLocks xmlns:a="http://schemas.openxmlformats.org/drawingml/2006/main" noChangeAspect="1"/>
+            </wp:cNvGraphicFramePr>
+            <a:graphic xmlns:a="http://schemas.openxmlformats.org/drawingml/2006/main">
+              <a:graphicData uri="http://schemas.openxmlformats.org/drawingml/2006/picture">
+                <pic:pic xmlns:pic="http://schemas.openxmlformats.org/drawingml/2006/picture">
+                  <pic:nvPicPr>
+                    <pic:cNvPr id="0" name="Picture 1"/>
+                    <pic:cNvPicPr>
+                      <a:picLocks noChangeAspect="1" noChangeArrowheads="1"/>
+                    </pic:cNvPicPr>
+                  </pic:nvPicPr>
+                  <pic:blipFill>
+                    <a:blip r:embed="rId11" cstate="print">
+                      <a:extLst>
+                        <a:ext uri="{28A0092B-C50C-407E-A947-70E740481C1C}">
+                          <a14:useLocalDpi xmlns:a14="http://schemas.microsoft.com/office/drawing/2010/main" val="0"/>
+                        </a:ext>
+                      </a:extLst>
+                    </a:blip>
+                    <a:srcRect/>
+                    <a:stretch>
+                      <a:fillRect/>
+                    </a:stretch>
+                  </pic:blipFill>
+                  <pic:spPr bwMode="auto">
+                    <a:xfrm>
+                      <a:off x="0" y="0"/>
+                      <a:ext cx="5756910" cy="4765040"/>
+                    </a:xfrm>
+                    <a:prstGeom prst="rect">
+                      <a:avLst/>
+                    </a:prstGeom>
+                    <a:noFill/>
+                    <a:ln>
+                      <a:noFill/>
+                    </a:ln>
+                  </pic:spPr>
+                </pic:pic>
+              </a:graphicData>
+            </a:graphic>
+          </wp:inline>
+        </w:drawing>
       </w:r>
     </w:p>
     <w:p>
@@ -4146,24 +4995,14 @@
       <w:r>
         <w:t xml:space="preserve">Tabela </w:t>
       </w:r>
-      <w:r>
-        <w:fldChar w:fldCharType="begin"/>
-      </w:r>
-      <w:r>
-        <w:instrText xml:space="preserve"> SEQ Tabela \* ARABIC </w:instrText>
-      </w:r>
-      <w:r>
-        <w:fldChar w:fldCharType="separate"/>
-      </w:r>
-      <w:r>
-        <w:rPr>
-          <w:noProof/>
-        </w:rPr>
-        <w:t>1</w:t>
-      </w:r>
-      <w:r>
-        <w:fldChar w:fldCharType="end"/>
-      </w:r>
+      <w:fldSimple w:instr=" SEQ Tabela \* ARABIC ">
+        <w:r>
+          <w:rPr>
+            <w:noProof/>
+          </w:rPr>
+          <w:t>2</w:t>
+        </w:r>
+      </w:fldSimple>
       <w:r>
         <w:t xml:space="preserve"> - Cronograma de pesquisa da Quinzena 1</w:t>
       </w:r>
@@ -4518,24 +5357,14 @@
       <w:r>
         <w:t xml:space="preserve">Tabela </w:t>
       </w:r>
-      <w:r>
-        <w:fldChar w:fldCharType="begin"/>
-      </w:r>
-      <w:r>
-        <w:instrText xml:space="preserve"> SEQ Tabela \* ARABIC </w:instrText>
-      </w:r>
-      <w:r>
-        <w:fldChar w:fldCharType="separate"/>
-      </w:r>
-      <w:r>
-        <w:rPr>
-          <w:noProof/>
-        </w:rPr>
-        <w:t>2</w:t>
-      </w:r>
-      <w:r>
-        <w:fldChar w:fldCharType="end"/>
-      </w:r>
+      <w:fldSimple w:instr=" SEQ Tabela \* ARABIC ">
+        <w:r>
+          <w:rPr>
+            <w:noProof/>
+          </w:rPr>
+          <w:t>3</w:t>
+        </w:r>
+      </w:fldSimple>
       <w:r>
         <w:t xml:space="preserve"> - Cronograma de pesquisa da Quinzena 2</w:t>
       </w:r>
@@ -4970,24 +5799,14 @@
       <w:r>
         <w:t xml:space="preserve">Tabela </w:t>
       </w:r>
-      <w:r>
-        <w:fldChar w:fldCharType="begin"/>
-      </w:r>
-      <w:r>
-        <w:instrText xml:space="preserve"> SEQ Tabela \* ARABIC </w:instrText>
-      </w:r>
-      <w:r>
-        <w:fldChar w:fldCharType="separate"/>
-      </w:r>
-      <w:r>
-        <w:rPr>
-          <w:noProof/>
-        </w:rPr>
-        <w:t>3</w:t>
-      </w:r>
-      <w:r>
-        <w:fldChar w:fldCharType="end"/>
-      </w:r>
+      <w:fldSimple w:instr=" SEQ Tabela \* ARABIC ">
+        <w:r>
+          <w:rPr>
+            <w:noProof/>
+          </w:rPr>
+          <w:t>4</w:t>
+        </w:r>
+      </w:fldSimple>
       <w:r>
         <w:t xml:space="preserve"> - Cronograma de pesquisa da Quinzena 3</w:t>
       </w:r>
@@ -5416,24 +6235,14 @@
       <w:r>
         <w:t xml:space="preserve">Tabela </w:t>
       </w:r>
-      <w:r>
-        <w:fldChar w:fldCharType="begin"/>
-      </w:r>
-      <w:r>
-        <w:instrText xml:space="preserve"> SEQ Tabela \* ARABIC </w:instrText>
-      </w:r>
-      <w:r>
-        <w:fldChar w:fldCharType="separate"/>
-      </w:r>
-      <w:r>
-        <w:rPr>
-          <w:noProof/>
-        </w:rPr>
-        <w:t>4</w:t>
-      </w:r>
-      <w:r>
-        <w:fldChar w:fldCharType="end"/>
-      </w:r>
+      <w:fldSimple w:instr=" SEQ Tabela \* ARABIC ">
+        <w:r>
+          <w:rPr>
+            <w:noProof/>
+          </w:rPr>
+          <w:t>5</w:t>
+        </w:r>
+      </w:fldSimple>
       <w:r>
         <w:t xml:space="preserve"> - Cronograma de pesquisa da Quinzena 4</w:t>
       </w:r>
@@ -5844,24 +6653,14 @@
       <w:r>
         <w:t xml:space="preserve">Tabela </w:t>
       </w:r>
-      <w:r>
-        <w:fldChar w:fldCharType="begin"/>
-      </w:r>
-      <w:r>
-        <w:instrText xml:space="preserve"> SEQ Tabela \* ARABIC </w:instrText>
-      </w:r>
-      <w:r>
-        <w:fldChar w:fldCharType="separate"/>
-      </w:r>
-      <w:r>
-        <w:rPr>
-          <w:noProof/>
-        </w:rPr>
-        <w:t>5</w:t>
-      </w:r>
-      <w:r>
-        <w:fldChar w:fldCharType="end"/>
-      </w:r>
+      <w:fldSimple w:instr=" SEQ Tabela \* ARABIC ">
+        <w:r>
+          <w:rPr>
+            <w:noProof/>
+          </w:rPr>
+          <w:t>6</w:t>
+        </w:r>
+      </w:fldSimple>
       <w:r>
         <w:t xml:space="preserve"> - Cronograma de pesquisa da Quinzena 5</w:t>
       </w:r>
@@ -6141,24 +6940,14 @@
       <w:r>
         <w:t xml:space="preserve">Tabela </w:t>
       </w:r>
-      <w:r>
-        <w:fldChar w:fldCharType="begin"/>
-      </w:r>
-      <w:r>
-        <w:instrText xml:space="preserve"> SEQ Tabela \* ARABIC </w:instrText>
-      </w:r>
-      <w:r>
-        <w:fldChar w:fldCharType="separate"/>
-      </w:r>
-      <w:r>
-        <w:rPr>
-          <w:noProof/>
-        </w:rPr>
-        <w:t>6</w:t>
-      </w:r>
-      <w:r>
-        <w:fldChar w:fldCharType="end"/>
-      </w:r>
+      <w:fldSimple w:instr=" SEQ Tabela \* ARABIC ">
+        <w:r>
+          <w:rPr>
+            <w:noProof/>
+          </w:rPr>
+          <w:t>7</w:t>
+        </w:r>
+      </w:fldSimple>
       <w:r>
         <w:t xml:space="preserve"> - Cronograma de pesquisa da Quinzena 6</w:t>
       </w:r>
@@ -6560,24 +7349,14 @@
       <w:r>
         <w:t xml:space="preserve">Tabela </w:t>
       </w:r>
-      <w:r>
-        <w:fldChar w:fldCharType="begin"/>
-      </w:r>
-      <w:r>
-        <w:instrText xml:space="preserve"> SEQ Tabela \* ARABIC </w:instrText>
-      </w:r>
-      <w:r>
-        <w:fldChar w:fldCharType="separate"/>
-      </w:r>
-      <w:r>
-        <w:rPr>
-          <w:noProof/>
-        </w:rPr>
-        <w:t>7</w:t>
-      </w:r>
-      <w:r>
-        <w:fldChar w:fldCharType="end"/>
-      </w:r>
+      <w:fldSimple w:instr=" SEQ Tabela \* ARABIC ">
+        <w:r>
+          <w:rPr>
+            <w:noProof/>
+          </w:rPr>
+          <w:t>8</w:t>
+        </w:r>
+      </w:fldSimple>
       <w:r>
         <w:t xml:space="preserve"> - Cronograma de pesquisa da Quinzena 7</w:t>
       </w:r>
@@ -7034,7 +7813,7 @@
         </w:rPr>
         <w:t>[dataset]. Disponível em:</w:t>
       </w:r>
-      <w:hyperlink r:id="rId11" w:history="1">
+      <w:hyperlink r:id="rId12" w:history="1">
         <w:r>
           <w:rPr>
             <w:rStyle w:val="Hyperlink"/>
@@ -7101,7 +7880,7 @@
         </w:rPr>
         <w:t xml:space="preserve"> [dataset]. DRYAD, 2018. Disponível em:</w:t>
       </w:r>
-      <w:hyperlink r:id="rId12" w:history="1">
+      <w:hyperlink r:id="rId13" w:history="1">
         <w:r>
           <w:rPr>
             <w:rStyle w:val="Hyperlink"/>
@@ -7116,7 +7895,7 @@
         </w:rPr>
         <w:t>&lt;</w:t>
       </w:r>
-      <w:hyperlink r:id="rId13" w:history="1">
+      <w:hyperlink r:id="rId14" w:history="1">
         <w:r>
           <w:rPr>
             <w:rStyle w:val="Hyperlink"/>
@@ -7208,7 +7987,7 @@
         </w:rPr>
         <w:t>. Disponível em: &lt;</w:t>
       </w:r>
-      <w:hyperlink r:id="rId14" w:history="1">
+      <w:hyperlink r:id="rId15" w:history="1">
         <w:r>
           <w:rPr>
             <w:rStyle w:val="Hyperlink"/>
@@ -7271,7 +8050,7 @@
         </w:rPr>
         <w:t xml:space="preserve">, 2026. DOI: &lt; </w:t>
       </w:r>
-      <w:hyperlink r:id="rId15" w:history="1">
+      <w:hyperlink r:id="rId16" w:history="1">
         <w:r>
           <w:rPr>
             <w:rStyle w:val="Hyperlink"/>
@@ -7341,7 +8120,7 @@
         </w:rPr>
         <w:t>, v. 10, n. 5, 2024. DOI: &lt;</w:t>
       </w:r>
-      <w:hyperlink r:id="rId16" w:history="1">
+      <w:hyperlink r:id="rId17" w:history="1">
         <w:r>
           <w:rPr>
             <w:rStyle w:val="Hyperlink"/>
@@ -7386,7 +8165,7 @@
         </w:rPr>
         <w:t>. Disponível em</w:t>
       </w:r>
-      <w:hyperlink r:id="rId17" w:history="1">
+      <w:hyperlink r:id="rId18" w:history="1">
         <w:r>
           <w:rPr>
             <w:rStyle w:val="Hyperlink"/>
@@ -7400,7 +8179,7 @@
         </w:rPr>
         <w:t>&lt;</w:t>
       </w:r>
-      <w:hyperlink r:id="rId18" w:history="1">
+      <w:hyperlink r:id="rId19" w:history="1">
         <w:r>
           <w:rPr>
             <w:rStyle w:val="Hyperlink"/>
@@ -7514,7 +8293,7 @@
           <w:shd w:val="pct15" w:color="auto" w:fill="FFFFFF"/>
         </w:rPr>
       </w:pPr>
-      <w:hyperlink r:id="rId19">
+      <w:hyperlink r:id="rId20">
         <w:r>
           <w:rPr>
             <w:color w:val="1155CC"/>
@@ -7548,7 +8327,7 @@
           <w:shd w:val="pct15" w:color="auto" w:fill="FFFFFF"/>
         </w:rPr>
       </w:pPr>
-      <w:hyperlink r:id="rId20">
+      <w:hyperlink r:id="rId21">
         <w:r>
           <w:rPr>
             <w:color w:val="1155CC"/>
@@ -7643,7 +8422,7 @@
     </w:p>
     <w:p/>
     <w:sectPr>
-      <w:headerReference w:type="default" r:id="rId21"/>
+      <w:headerReference w:type="default" r:id="rId22"/>
       <w:pgSz w:w="11901" w:h="16817"/>
       <w:pgMar w:top="1701" w:right="1134" w:bottom="1134" w:left="1701" w:header="1134" w:footer="709" w:gutter="0"/>
       <w:pgNumType w:start="6"/>
@@ -7705,11 +8484,6 @@
         <w:docPartUnique/>
       </w:docPartObj>
     </w:sdtPr>
-    <w:sdtEndPr>
-      <w:rPr>
-        <w:rStyle w:val="PageNumber"/>
-      </w:rPr>
-    </w:sdtEndPr>
     <w:sdtContent>
       <w:p>
         <w:pPr>
@@ -7768,11 +8542,6 @@
         <w:docPartUnique/>
       </w:docPartObj>
     </w:sdtPr>
-    <w:sdtEndPr>
-      <w:rPr>
-        <w:rStyle w:val="PageNumber"/>
-      </w:rPr>
-    </w:sdtEndPr>
     <w:sdtContent>
       <w:p>
         <w:pPr>
@@ -9463,6 +10232,86 @@
       <w:u w:val="single"/>
     </w:rPr>
   </w:style>
+  <w:style w:type="table" w:styleId="PlainTable2">
+    <w:name w:val="Plain Table 2"/>
+    <w:basedOn w:val="TableNormal"/>
+    <w:uiPriority w:val="42"/>
+    <w:rsid w:val="00555E7D"/>
+    <w:pPr>
+      <w:spacing w:after="0" w:line="240" w:lineRule="auto"/>
+    </w:pPr>
+    <w:tblPr>
+      <w:tblStyleRowBandSize w:val="1"/>
+      <w:tblStyleColBandSize w:val="1"/>
+      <w:tblBorders>
+        <w:top w:val="single" w:sz="4" w:space="0" w:color="7F7F7F" w:themeColor="text1" w:themeTint="80"/>
+        <w:bottom w:val="single" w:sz="4" w:space="0" w:color="7F7F7F" w:themeColor="text1" w:themeTint="80"/>
+      </w:tblBorders>
+    </w:tblPr>
+    <w:tblStylePr w:type="firstRow">
+      <w:rPr>
+        <w:b/>
+        <w:bCs/>
+      </w:rPr>
+      <w:tblPr/>
+      <w:tcPr>
+        <w:tcBorders>
+          <w:bottom w:val="single" w:sz="4" w:space="0" w:color="7F7F7F" w:themeColor="text1" w:themeTint="80"/>
+        </w:tcBorders>
+      </w:tcPr>
+    </w:tblStylePr>
+    <w:tblStylePr w:type="lastRow">
+      <w:rPr>
+        <w:b/>
+        <w:bCs/>
+      </w:rPr>
+      <w:tblPr/>
+      <w:tcPr>
+        <w:tcBorders>
+          <w:top w:val="single" w:sz="4" w:space="0" w:color="7F7F7F" w:themeColor="text1" w:themeTint="80"/>
+        </w:tcBorders>
+      </w:tcPr>
+    </w:tblStylePr>
+    <w:tblStylePr w:type="firstCol">
+      <w:rPr>
+        <w:b/>
+        <w:bCs/>
+      </w:rPr>
+    </w:tblStylePr>
+    <w:tblStylePr w:type="lastCol">
+      <w:rPr>
+        <w:b/>
+        <w:bCs/>
+      </w:rPr>
+    </w:tblStylePr>
+    <w:tblStylePr w:type="band1Vert">
+      <w:tblPr/>
+      <w:tcPr>
+        <w:tcBorders>
+          <w:left w:val="single" w:sz="4" w:space="0" w:color="7F7F7F" w:themeColor="text1" w:themeTint="80"/>
+          <w:right w:val="single" w:sz="4" w:space="0" w:color="7F7F7F" w:themeColor="text1" w:themeTint="80"/>
+        </w:tcBorders>
+      </w:tcPr>
+    </w:tblStylePr>
+    <w:tblStylePr w:type="band2Vert">
+      <w:tblPr/>
+      <w:tcPr>
+        <w:tcBorders>
+          <w:left w:val="single" w:sz="4" w:space="0" w:color="7F7F7F" w:themeColor="text1" w:themeTint="80"/>
+          <w:right w:val="single" w:sz="4" w:space="0" w:color="7F7F7F" w:themeColor="text1" w:themeTint="80"/>
+        </w:tcBorders>
+      </w:tcPr>
+    </w:tblStylePr>
+    <w:tblStylePr w:type="band1Horz">
+      <w:tblPr/>
+      <w:tcPr>
+        <w:tcBorders>
+          <w:top w:val="single" w:sz="4" w:space="0" w:color="7F7F7F" w:themeColor="text1" w:themeTint="80"/>
+          <w:bottom w:val="single" w:sz="4" w:space="0" w:color="7F7F7F" w:themeColor="text1" w:themeTint="80"/>
+        </w:tcBorders>
+      </w:tcPr>
+    </w:tblStylePr>
+  </w:style>
 </w:styles>
 </file>
 

</xml_diff>